<commit_message>
feat(reports): an operator's own reference.docx; DOCX caption/figure centring moved into styles; post-processor slimmed to image borders
- template.json assets may 'replace' a template file: an installed
  branding/reference.docx is used in place of the shipped one (fallback when
  absent, never a gap); declared on the pentest template
- reference.docx: ImageCaption, TableCaption, Figure, Captioned Figure centred
- fix-docx-report.py: only the tight image border remains. Rendered with
  screenshots: the wrapper-flattening / caption-extraction / image-extraction
  steps changed nothing (no #tbl/#fig blocks), and 'left-align every cell'
  undid the template's centred columns
- Reports page: 'Template files'; a missing replacement is not counted missing

Co-Authored-By: Claude Opus 5.5 (1M context) <noreply@anthropic.com>
</commit_message>
<xml_diff>
--- a/report-templates/pentest/reference.docx
+++ b/report-templates/pentest/reference.docx
@@ -1070,21 +1070,29 @@
     <w:basedOn w:val="Caption"/>
     <w:pPr>
       <w:keepNext/>
+      <w:jc w:val="center"/>
     </w:pPr>
   </w:style>
   <w:style w:type="paragraph" w:customStyle="1" w:styleId="ImageCaption">
     <w:name w:val="Image Caption"/>
     <w:basedOn w:val="Caption"/>
+    <w:pPr>
+      <w:jc w:val="center"/>
+    </w:pPr>
   </w:style>
   <w:style w:type="paragraph" w:customStyle="1" w:styleId="Figure">
     <w:name w:val="Figure"/>
     <w:basedOn w:val="Normal"/>
+    <w:pPr>
+      <w:jc w:val="center"/>
+    </w:pPr>
   </w:style>
   <w:style w:type="paragraph" w:customStyle="1" w:styleId="CaptionedFigure">
     <w:name w:val="Captioned Figure"/>
     <w:basedOn w:val="Figure"/>
     <w:pPr>
       <w:keepNext/>
+      <w:jc w:val="center"/>
     </w:pPr>
   </w:style>
   <w:style w:type="character" w:customStyle="1" w:styleId="BodyTextChar">

</xml_diff>

<commit_message>
feat(reports): the title page image and the logo reach the Word report; Markdown editor on the report's own text (2.407.0 / 5.293.0)
The Reports page's template section listed the logo but not the title
page's main picture, which lived only inside reference.docx. template.json
now declares a Title page image (img/cover.jpg) and the logo is used in
Word too. The Word post-processor puts each installed image in place of
its placeholder drawing (named bluestick-logo / bluestick-cover in the
shipped reference.docx), scaled to fit without distortion, and drops the
placeholder pictures nothing points at. An operator's own Word styles
file without those names keeps its pictures.

The executive summary and system description use the MarkdownField editor.

Co-Authored-By: Claude Opus 5.5 (1M context) <noreply@anthropic.com>
</commit_message>
<xml_diff>
--- a/report-templates/pentest/reference.docx
+++ b/report-templates/pentest/reference.docx
@@ -1145,7 +1145,7 @@
               <wp:inline distT="0" distB="0" distL="0" distR="0">
                 <wp:extent cx="1563370" cy="455930"/>
                 <wp:effectExtent l="0" t="0" r="0" b="0"/>
-                <wp:docPr id="6" name="Image2" descr="" title=""/>
+                <wp:docPr id="6" name="bluestick-logo" descr="" title=""/>
                 <wp:cNvGraphicFramePr>
                   <a:graphicFrameLocks xmlns:a="http://schemas.openxmlformats.org/drawingml/2006/main" noChangeAspect="1"/>
                 </wp:cNvGraphicFramePr>
@@ -1153,7 +1153,7 @@
                   <a:graphicData uri="http://schemas.openxmlformats.org/drawingml/2006/picture">
                     <pic:pic xmlns:pic="http://schemas.openxmlformats.org/drawingml/2006/picture">
                       <pic:nvPicPr>
-                        <pic:cNvPr id="6" name="Image2" descr="" title=""/>
+                        <pic:cNvPr id="6" name="bluestick-logo" descr="" title=""/>
                         <pic:cNvPicPr>
                           <a:picLocks noChangeAspect="1" noChangeArrowheads="1"/>
                         </pic:cNvPicPr>
@@ -1577,7 +1577,7 @@
               <wp:inline distT="0" distB="0" distL="0" distR="0">
                 <wp:extent cx="1567180" cy="457200"/>
                 <wp:effectExtent l="0" t="0" r="0" b="0"/>
-                <wp:docPr id="1" name="Picture 1" descr="" title=""/>
+                <wp:docPr id="1" name="bluestick-logo" descr="" title=""/>
                 <wp:cNvGraphicFramePr>
                   <a:graphicFrameLocks xmlns:a="http://schemas.openxmlformats.org/drawingml/2006/main" noChangeAspect="1"/>
                 </wp:cNvGraphicFramePr>
@@ -1585,7 +1585,7 @@
                   <a:graphicData uri="http://schemas.openxmlformats.org/drawingml/2006/picture">
                     <pic:pic xmlns:pic="http://schemas.openxmlformats.org/drawingml/2006/picture">
                       <pic:nvPicPr>
-                        <pic:cNvPr id="1" name="Picture 1" descr="" title=""/>
+                        <pic:cNvPr id="1" name="bluestick-logo" descr="" title=""/>
                         <pic:cNvPicPr>
                           <a:picLocks noChangeAspect="1" noChangeArrowheads="1"/>
                         </pic:cNvPicPr>
@@ -1751,7 +1751,7 @@
               <wp:inline distT="0" distB="0" distL="0" distR="0">
                 <wp:extent cx="1563370" cy="455930"/>
                 <wp:effectExtent l="0" t="0" r="0" b="0"/>
-                <wp:docPr id="2" name="Picture 5" descr="" title=""/>
+                <wp:docPr id="2" name="bluestick-logo" descr="" title=""/>
                 <wp:cNvGraphicFramePr>
                   <a:graphicFrameLocks xmlns:a="http://schemas.openxmlformats.org/drawingml/2006/main" noChangeAspect="1"/>
                 </wp:cNvGraphicFramePr>
@@ -1759,7 +1759,7 @@
                   <a:graphicData uri="http://schemas.openxmlformats.org/drawingml/2006/picture">
                     <pic:pic xmlns:pic="http://schemas.openxmlformats.org/drawingml/2006/picture">
                       <pic:nvPicPr>
-                        <pic:cNvPr id="2" name="Picture 5" descr="" title=""/>
+                        <pic:cNvPr id="2" name="bluestick-logo" descr="" title=""/>
                         <pic:cNvPicPr>
                           <a:picLocks noChangeAspect="1" noChangeArrowheads="1"/>
                         </pic:cNvPicPr>
@@ -1874,7 +1874,7 @@
           <wp:extent cx="6858000" cy="4572000"/>
           <wp:effectExtent l="0" t="0" r="0" b="0"/>
           <wp:wrapNone/>
-          <wp:docPr id="3" name="Picture 6" descr="" title=""/>
+          <wp:docPr id="3" name="bluestick-cover" descr="" title=""/>
           <wp:cNvGraphicFramePr>
             <a:graphicFrameLocks xmlns:a="http://schemas.openxmlformats.org/drawingml/2006/main" noChangeAspect="1"/>
           </wp:cNvGraphicFramePr>
@@ -1882,7 +1882,7 @@
             <a:graphicData uri="http://schemas.openxmlformats.org/drawingml/2006/picture">
               <pic:pic xmlns:pic="http://schemas.openxmlformats.org/drawingml/2006/picture">
                 <pic:nvPicPr>
-                  <pic:cNvPr id="3" name="Picture 6" descr="" title=""/>
+                  <pic:cNvPr id="3" name="bluestick-cover" descr="" title=""/>
                   <pic:cNvPicPr>
                     <a:picLocks noChangeAspect="1" noChangeArrowheads="1"/>
                   </pic:cNvPicPr>
@@ -1969,7 +1969,7 @@
               <wp:inline distT="0" distB="0" distL="0" distR="0">
                 <wp:extent cx="1567180" cy="457200"/>
                 <wp:effectExtent l="0" t="0" r="0" b="0"/>
-                <wp:docPr id="7" name="Picture 1 Copy 1" descr="" title=""/>
+                <wp:docPr id="7" name="bluestick-logo" descr="" title=""/>
                 <wp:cNvGraphicFramePr>
                   <a:graphicFrameLocks xmlns:a="http://schemas.openxmlformats.org/drawingml/2006/main" noChangeAspect="1"/>
                 </wp:cNvGraphicFramePr>
@@ -1977,7 +1977,7 @@
                   <a:graphicData uri="http://schemas.openxmlformats.org/drawingml/2006/picture">
                     <pic:pic xmlns:pic="http://schemas.openxmlformats.org/drawingml/2006/picture">
                       <pic:nvPicPr>
-                        <pic:cNvPr id="7" name="Picture 1 Copy 1" descr="" title=""/>
+                        <pic:cNvPr id="7" name="bluestick-logo" descr="" title=""/>
                         <pic:cNvPicPr>
                           <a:picLocks noChangeAspect="1" noChangeArrowheads="1"/>
                         </pic:cNvPicPr>

</xml_diff>

<commit_message>
fix(reports): toolbar icons drawn at full size; table labels keep with their tables in Word (2.407.2 / 5.293.1)
Found in the Chrome pass:
- The Markdown toolbar's buttons kept the small button's side padding, so
  each icon was squeezed to 4px (dots). Now icon-size buttons, 28px.
- "Severity count with remediation timeline (days)" ended a page with its
  table on the next. reference.docx gains a Table Label style (keep with
  next, no first-line indent); every bold label in report.qmd uses it.

Co-Authored-By: Claude Opus 5.5 (1M context) <noreply@anthropic.com>
</commit_message>
<xml_diff>
--- a/report-templates/pentest/reference.docx
+++ b/report-templates/pentest/reference.docx
@@ -4164,6 +4164,20 @@
       </w:tblBorders>
     </w:tblPr>
   </w:style>
+  <w:style w:type="paragraph" w:customStyle="1" w:styleId="TableLabel">
+    <w:name w:val="Table Label"/>
+    <w:basedOn w:val="BodyText"/>
+    <w:next w:val="BodyText"/>
+    <w:qFormat/>
+    <w:pPr>
+      <w:keepNext/>
+      <w:keepLines/>
+      <w:spacing w:before="160" w:after="60"/>
+      <w:ind w:firstLine="0"/>
+      <w:jc w:val="left"/>
+    </w:pPr>
+    <w:rPr/>
+  </w:style>
 </w:styles>
 </file>
 

</xml_diff>